<commit_message>
Formulaire POC fait (à tester)
</commit_message>
<xml_diff>
--- a/Documents/TP4_Phase1_PoC.docx
+++ b/Documents/TP4_Phase1_PoC.docx
@@ -29,6 +29,12 @@
         </w:rPr>
         <w:t>Membre de l’équipe :</w:t>
       </w:r>
+      <w:r>
+        <w:rPr>
+          <w:lang w:val="fr-CA"/>
+        </w:rPr>
+        <w:t xml:space="preserve"> Thomas Lajoie et Mirko Brlek</w:t>
+      </w:r>
     </w:p>
     <w:p>
       <w:pPr>
@@ -41,6 +47,12 @@
           <w:lang w:val="fr-CA"/>
         </w:rPr>
         <w:t>Groupe :</w:t>
+      </w:r>
+      <w:r>
+        <w:rPr>
+          <w:lang w:val="fr-CA"/>
+        </w:rPr>
+        <w:t xml:space="preserve"> 1010</w:t>
       </w:r>
       <w:r>
         <w:rPr>
@@ -75,6 +87,32 @@
         </w:rPr>
         <w:t>Décrivez clairement l’objectif de cette preuve de concept. Quel élément critique de votre solution cherchez-vous à valider ? Pourquoi cette validation est-elle importante dans le contexte du projet ?</w:t>
       </w:r>
+      <w:r>
+        <w:rPr>
+          <w:lang w:val="fr-CA"/>
+        </w:rPr>
+        <w:t xml:space="preserve"> </w:t>
+      </w:r>
+    </w:p>
+    <w:p>
+      <w:pPr>
+        <w:rPr>
+          <w:lang w:val="fr-CA"/>
+        </w:rPr>
+      </w:pPr>
+      <w:r>
+        <w:rPr>
+          <w:lang w:val="fr-CA"/>
+        </w:rPr>
+        <w:t>Notre but est de</w:t>
+      </w:r>
+    </w:p>
+    <w:p>
+      <w:pPr>
+        <w:rPr>
+          <w:lang w:val="fr-CA"/>
+        </w:rPr>
+      </w:pPr>
     </w:p>
     <w:p>
       <w:pPr>
@@ -346,16 +384,8 @@
           <w:lang w:val="fr-CA"/>
         </w:rPr>
         <w:br/>
-        <w:t xml:space="preserve">- </w:t>
+        <w:t>- Risques potentiels</w:t>
       </w:r>
-      <w:proofErr w:type="gramStart"/>
-      <w:r>
-        <w:rPr>
-          <w:lang w:val="fr-CA"/>
-        </w:rPr>
-        <w:t>Risques potentiels</w:t>
-      </w:r>
-      <w:proofErr w:type="gramEnd"/>
     </w:p>
     <w:p>
       <w:pPr>
@@ -399,12 +429,12 @@
       </w:r>
     </w:p>
     <w:sectPr>
-      <w:headerReference w:type="even" r:id="rId8"/>
-      <w:headerReference w:type="default" r:id="rId9"/>
-      <w:footerReference w:type="even" r:id="rId10"/>
-      <w:footerReference w:type="default" r:id="rId11"/>
-      <w:headerReference w:type="first" r:id="rId12"/>
-      <w:footerReference w:type="first" r:id="rId13"/>
+      <w:headerReference w:type="even" r:id="rId11"/>
+      <w:headerReference w:type="default" r:id="rId12"/>
+      <w:footerReference w:type="even" r:id="rId13"/>
+      <w:footerReference w:type="default" r:id="rId14"/>
+      <w:headerReference w:type="first" r:id="rId15"/>
+      <w:footerReference w:type="first" r:id="rId16"/>
       <w:pgSz w:w="12240" w:h="15840"/>
       <w:pgMar w:top="1440" w:right="1800" w:bottom="1440" w:left="1800" w:header="720" w:footer="720" w:gutter="0"/>
       <w:cols w:space="720"/>
@@ -12431,7 +12461,12 @@
 </file>
 
 <file path=customXml/item1.xml><?xml version="1.0" encoding="utf-8"?>
-<b:Sources xmlns:b="http://schemas.openxmlformats.org/officeDocument/2006/bibliography" xmlns="http://schemas.openxmlformats.org/officeDocument/2006/bibliography" SelectedStyle="/APA.XSL" StyleName="APA"/>
+<?mso-contentType ?>
+<FormTemplates xmlns="http://schemas.microsoft.com/sharepoint/v3/contenttype/forms">
+  <Display>DocumentLibraryForm</Display>
+  <Edit>DocumentLibraryForm</Edit>
+  <New>DocumentLibraryForm</New>
+</FormTemplates>
 </file>
 
 <file path=customXml/item2.xml><?xml version="1.0" encoding="utf-8"?>
@@ -12579,12 +12614,7 @@
 </file>
 
 <file path=customXml/item3.xml><?xml version="1.0" encoding="utf-8"?>
-<?mso-contentType ?>
-<FormTemplates xmlns="http://schemas.microsoft.com/sharepoint/v3/contenttype/forms">
-  <Display>DocumentLibraryForm</Display>
-  <Edit>DocumentLibraryForm</Edit>
-  <New>DocumentLibraryForm</New>
-</FormTemplates>
+<b:Sources xmlns:b="http://schemas.openxmlformats.org/officeDocument/2006/bibliography" xmlns="http://schemas.openxmlformats.org/officeDocument/2006/bibliography" SelectedStyle="/APA.XSL" StyleName="APA"/>
 </file>
 
 <file path=customXml/item4.xml><?xml version="1.0" encoding="utf-8"?>
@@ -12596,6 +12626,32 @@
 </file>
 
 <file path=customXml/itemProps1.xml><?xml version="1.0" encoding="utf-8"?>
+<ds:datastoreItem xmlns:ds="http://schemas.openxmlformats.org/officeDocument/2006/customXml" ds:itemID="{9A1CB954-B7AE-4FBB-BD0D-8B85DA415DCB}">
+  <ds:schemaRefs>
+    <ds:schemaRef ds:uri="http://schemas.microsoft.com/sharepoint/v3/contenttype/forms"/>
+  </ds:schemaRefs>
+</ds:datastoreItem>
+</file>
+
+<file path=customXml/itemProps2.xml><?xml version="1.0" encoding="utf-8"?>
+<ds:datastoreItem xmlns:ds="http://schemas.openxmlformats.org/officeDocument/2006/customXml" ds:itemID="{119CC3B3-14C1-482C-9713-0A1391082D62}">
+  <ds:schemaRefs>
+    <ds:schemaRef ds:uri="http://schemas.microsoft.com/office/2006/metadata/contentType"/>
+    <ds:schemaRef ds:uri="http://schemas.microsoft.com/office/2006/metadata/properties/metaAttributes"/>
+    <ds:schemaRef ds:uri="http://www.w3.org/2001/XMLSchema"/>
+    <ds:schemaRef ds:uri="http://schemas.microsoft.com/office/2006/metadata/properties"/>
+    <ds:schemaRef ds:uri="58914a97-80a9-4312-8427-8216aff5104f"/>
+    <ds:schemaRef ds:uri="http://schemas.microsoft.com/office/2006/documentManagement/types"/>
+    <ds:schemaRef ds:uri="http://schemas.microsoft.com/office/infopath/2007/PartnerControls"/>
+    <ds:schemaRef ds:uri="http://schemas.openxmlformats.org/package/2006/metadata/core-properties"/>
+    <ds:schemaRef ds:uri="http://purl.org/dc/elements/1.1/"/>
+    <ds:schemaRef ds:uri="http://purl.org/dc/terms/"/>
+    <ds:schemaRef ds:uri="http://schemas.microsoft.com/internal/obd"/>
+  </ds:schemaRefs>
+</ds:datastoreItem>
+</file>
+
+<file path=customXml/itemProps3.xml><?xml version="1.0" encoding="utf-8"?>
 <ds:datastoreItem xmlns:ds="http://schemas.openxmlformats.org/officeDocument/2006/customXml" ds:itemID="{EF278816-EC6F-A645-907D-7F25AECB1D4A}">
   <ds:schemaRefs>
     <ds:schemaRef ds:uri="http://schemas.openxmlformats.org/officeDocument/2006/bibliography"/>
@@ -12603,14 +12659,12 @@
 </ds:datastoreItem>
 </file>
 
-<file path=customXml/itemProps2.xml><?xml version="1.0" encoding="utf-8"?>
-<ds:datastoreItem xmlns:ds="http://schemas.openxmlformats.org/officeDocument/2006/customXml" ds:itemID="{119CC3B3-14C1-482C-9713-0A1391082D62}"/>
-</file>
-
-<file path=customXml/itemProps3.xml><?xml version="1.0" encoding="utf-8"?>
-<ds:datastoreItem xmlns:ds="http://schemas.openxmlformats.org/officeDocument/2006/customXml" ds:itemID="{9A1CB954-B7AE-4FBB-BD0D-8B85DA415DCB}"/>
-</file>
-
 <file path=customXml/itemProps4.xml><?xml version="1.0" encoding="utf-8"?>
-<ds:datastoreItem xmlns:ds="http://schemas.openxmlformats.org/officeDocument/2006/customXml" ds:itemID="{D389DC6D-5B0B-44F7-8546-A6A224271B02}"/>
+<ds:datastoreItem xmlns:ds="http://schemas.openxmlformats.org/officeDocument/2006/customXml" ds:itemID="{D389DC6D-5B0B-44F7-8546-A6A224271B02}">
+  <ds:schemaRefs>
+    <ds:schemaRef ds:uri="http://schemas.microsoft.com/office/2006/metadata/properties"/>
+    <ds:schemaRef ds:uri="http://schemas.microsoft.com/office/infopath/2007/PartnerControls"/>
+    <ds:schemaRef ds:uri="58914a97-80a9-4312-8427-8216aff5104f"/>
+  </ds:schemaRefs>
+</ds:datastoreItem>
 </file>
</xml_diff>